<commit_message>
Changes made in Essence of Stone according to rating requirements (PG instead of R for Chapter 8 Camping).
</commit_message>
<xml_diff>
--- a/resources/essenceOfStoneENWithTOCNoPageNumbers.docx
+++ b/resources/essenceOfStoneENWithTOCNoPageNumbers.docx
@@ -4135,15 +4135,7 @@
         <w:t>Clip</w:t>
       </w:r>
       <w:r>
-        <w:t xml:space="preserve">, as if he were </w:t>
-      </w:r>
-      <w:proofErr w:type="gramStart"/>
-      <w:r>
-        <w:t>speaking</w:t>
-      </w:r>
-      <w:proofErr w:type="gramEnd"/>
-      <w:r>
-        <w:t xml:space="preserve"> right beside me:</w:t>
+        <w:t>, as if he were speaking right beside me:</w:t>
       </w:r>
     </w:p>
     <w:p>
@@ -5981,28 +5973,14 @@
       <w:pPr>
         <w:pStyle w:val="Heading1"/>
       </w:pPr>
-      <w:bookmarkStart w:id="10" w:name="_Toc227499647"/>
       <w:r>
         <w:lastRenderedPageBreak/>
         <w:t>Chapter 8. Camping</w:t>
       </w:r>
-      <w:bookmarkEnd w:id="10"/>
-    </w:p>
-    <w:p>
-      <w:r>
-        <w:t xml:space="preserve">The clearing we chose for the night turned out to be unexpectedly cozy and picturesque. It nestled between two rocky outcrops of the neighboring mountain: behind us rose a steep, forested slope; to the left, beyond a ledge, the river shimmered in the dusk; and to the right, </w:t>
-      </w:r>
-      <w:r>
-        <w:t>a dozen meters away</w:t>
-      </w:r>
-      <w:r>
-        <w:t xml:space="preserve">, ran a trail, from which we were hidden by a rocky spur. Another pleasant surprise—and a stroke of real luck—was that, when we went down to the river, we found a spring nearby, emerging from a crack in the rock and flowing straight into the </w:t>
-      </w:r>
-      <w:r>
-        <w:t>river</w:t>
-      </w:r>
-      <w:r>
-        <w:t>. The spring was wonderfully cold, and its taste struck me as possessing the subtlest bouquet, like an expensive wine. We drank our fill and topped up our bottles, which by then were nearly empty.</w:t>
+    </w:p>
+    <w:p>
+      <w:r>
+        <w:t>The clearing we chose for the night turned out to be unexpectedly cozy and picturesque. It nestled between two rocky outcrops of the neighboring mountain: behind us rose a steep, forested slope; to the left, beyond a ledge, the river shimmered in the dusk; and to the right, a dozen meters away, ran a trail, from which we were hidden by a rocky spur. Another pleasant surprise—and a stroke of real luck—was that, when we went down to the river, we found a spring nearby, emerging from a crack in the rock and flowing straight into the river. The spring was wonderfully cold, and its taste struck me as possessing the subtlest bouquet, like an expensive wine. We drank our fill and topped up our bottles, which by then were nearly empty.</w:t>
       </w:r>
     </w:p>
     <w:p>
@@ -6057,13 +6035,7 @@
         <w:t>beeeep</w:t>
       </w:r>
       <w:r>
-        <w:t xml:space="preserve"> sounded in my </w:t>
-      </w:r>
-      <w:r>
-        <w:t>clip</w:t>
-      </w:r>
-      <w:r>
-        <w:t>. I flinched. Beside the green icon with the number “1,” a new yellow one appeared, glowing with the number “3.”</w:t>
+        <w:t xml:space="preserve"> sounded in my clip. I flinched. Beside the green icon with the number “1,” a new yellow one appeared, glowing with the number “3.”</w:t>
       </w:r>
     </w:p>
     <w:p>
@@ -6088,13 +6060,7 @@
     </w:p>
     <w:p>
       <w:r>
-        <w:t xml:space="preserve">The difference was immediately obvious. The emerald glow around them was noticeably darker than the background. I blinked, focusing—and then noticed dark green patches at their belts: boxes, and judging by their intensity, far from empty. A second later my eyes caught on the masks covering their faces and the thin </w:t>
-      </w:r>
-      <w:r>
-        <w:t>clip</w:t>
-      </w:r>
-      <w:r>
-        <w:t>s at their temples.</w:t>
+        <w:t>The difference was immediately obvious. The emerald glow around them was noticeably darker than the background. I blinked, focusing—and then noticed dark green patches at their belts: boxes, and judging by their intensity, far from empty. A second later my eyes caught on the masks covering their faces and the thin clips at their temples.</w:t>
       </w:r>
     </w:p>
     <w:p>
@@ -6150,13 +6116,7 @@
     </w:p>
     <w:p>
       <w:r>
-        <w:t>“Mini-boxes,” Fang explained, catching our look. “Emergency reserve. In case things get tight and there’s no quint</w:t>
-      </w:r>
-      <w:r>
-        <w:t>a</w:t>
-      </w:r>
-      <w:r>
-        <w:t xml:space="preserve"> handy.”</w:t>
+        <w:t>“Mini-boxes,” Fang explained, catching our look. “Emergency reserve. In case things get tight and there’s no quinta handy.”</w:t>
       </w:r>
     </w:p>
     <w:p>
@@ -6216,13 +6176,7 @@
     </w:p>
     <w:p>
       <w:r>
-        <w:t>So I shifted my attention to the third</w:t>
-      </w:r>
-      <w:r>
-        <w:t xml:space="preserve"> </w:t>
-      </w:r>
-      <w:r>
-        <w:t>of them.</w:t>
+        <w:t>So I shifted my attention to the third of them.</w:t>
       </w:r>
     </w:p>
     <w:p>
@@ -6379,22 +6333,7 @@
     </w:p>
     <w:p>
       <w:r>
-        <w:t xml:space="preserve">“We’ve been </w:t>
-      </w:r>
-      <w:r>
-        <w:rPr>
-          <w:lang w:val="en-US"/>
-        </w:rPr>
-        <w:t>harvesting</w:t>
-      </w:r>
-      <w:r>
-        <w:t xml:space="preserve"> around the new Gates here for two days now. Today we started out along your trail—but almost right away it was clear someone had already passed through. Nothing but </w:t>
-      </w:r>
-      <w:r>
-        <w:t>crumbs</w:t>
-      </w:r>
-      <w:r>
-        <w:t xml:space="preserve"> left. So we veered right, into the spurs. And that’s where it really kicked off! Loads of goodies, and proper pies, too—five times at least. One of them, honestly, was half a cliff!”</w:t>
+        <w:t>“We’ve been harvesting around the new Gates here for two days now. Today we started out along your trail—but almost right away it was clear someone had already passed through. Nothing but crumbs left. So we veered right, into the spurs. And that’s where it really kicked off! Loads of goodies, and proper pies, too—five times at least. One of them, honestly, was half a cliff!”</w:t>
       </w:r>
     </w:p>
     <w:p>
@@ -6449,13 +6388,7 @@
     </w:p>
     <w:p>
       <w:r>
-        <w:t xml:space="preserve">We finished eating. I gathered the bowls </w:t>
-      </w:r>
-      <w:r>
-        <w:t xml:space="preserve">and spoons </w:t>
-      </w:r>
-      <w:r>
-        <w:t xml:space="preserve">into a trash bag. Zara walked over to the table, picked up the thermos, and unscrewed the lid. The aroma of mountain herbs rose into the air—spicy, slightly </w:t>
+        <w:t xml:space="preserve">We finished eating. I gathered the bowls and spoons into a trash bag. Zara walked over to the table, picked up the thermos, and unscrewed the lid. The aroma of mountain herbs rose into the air—spicy, slightly </w:t>
       </w:r>
       <w:r>
         <w:lastRenderedPageBreak/>
@@ -6464,13 +6397,7 @@
     </w:p>
     <w:p>
       <w:r>
-        <w:t>I don’t know whom she had left that cup for—but I felt an overwhelming urge to take it. Without paying attention to anyone and without think</w:t>
-      </w:r>
-      <w:r>
-        <w:t>ing</w:t>
-      </w:r>
-      <w:r>
-        <w:t xml:space="preserve"> about politeness, I simply walked up, picked up the cup, and carried it back to my seat.</w:t>
+        <w:t>I don’t know whom she had left that cup for—but I felt an overwhelming urge to take it. Without paying attention to anyone and without thinking about politeness, I simply walked up, picked up the cup, and carried it back to my seat.</w:t>
       </w:r>
     </w:p>
     <w:p>
@@ -6509,18 +6436,13 @@
       </w:r>
     </w:p>
     <w:p>
-      <w:r>
-        <w:t xml:space="preserve">“What do you </w:t>
-      </w:r>
-      <w:r>
+      <w:pPr>
         <w:rPr>
-          <w:i/>
-          <w:iCs/>
+          <w:lang w:val="ru-RU"/>
         </w:rPr>
-        <w:t>mean</w:t>
-      </w:r>
-      <w:r>
-        <w:t>—what? Freedom, brother. We’re free striders. All worlds are open to us. All the quinta is ours. You won’t get that kind of high with the Agency.”</w:t>
+      </w:pPr>
+      <w:r>
+        <w:t xml:space="preserve">“What do you mean—what? Freedom, brother. We’re free striders. All worlds are open to us. All the quinta is ours. You won’t get that kind of freedom with the Agency.” </w:t>
       </w:r>
     </w:p>
     <w:p>
@@ -6560,33 +6482,17 @@
     </w:p>
     <w:p>
       <w:r>
-        <w:t>“Do that—while you still can,” Fang chuckled. “And meanwhile, we’ll have a little fun.”</w:t>
-      </w:r>
-    </w:p>
-    <w:p>
-      <w:r>
-        <w:t>He shifted his folding chair slightly away from the fire and settled in. Stretched his legs out, rested his hands on them, and closed his eyes. I noticed the sleeves of his shirt suddenly tighten, forming dense bands—like bracelets—just above his elbows.</w:t>
-      </w:r>
-    </w:p>
-    <w:p>
-      <w:r>
-        <w:t xml:space="preserve">Fang jerked, as if struck by a jolt or a needle. His breathing grew heavy, his eyes flew open. His whole body tensed, as if he were climbing a steep slope. It lasted maybe </w:t>
-      </w:r>
-      <w:r>
-        <w:t>half a minute</w:t>
-      </w:r>
-      <w:r>
-        <w:t>.</w:t>
-      </w:r>
-    </w:p>
-    <w:p>
-      <w:r>
-        <w:t>Then he slowly went slack. Relaxed. And something flared in his eyes—a strange inner fire. His face lit up with a blissful, triumphant smile. His mouth fell open, releasing a long, satisfied moan:</w:t>
-      </w:r>
-    </w:p>
-    <w:p>
-      <w:r>
-        <w:t>“Aaaaah…”</w:t>
+        <w:t>“Do that—while you still can,” Fang chuckled. “And meanwhile, we’ll relax a little.”</w:t>
+      </w:r>
+    </w:p>
+    <w:p>
+      <w:r>
+        <w:t>He shifted his folding chair slightly away from the fire and settled in. He stretched his legs out, rested his hands on them, and closed his eyes. I noticed the sleeves of his shirt suddenly tighten, forming dense bands—like bracelets—just above his elbows.</w:t>
+      </w:r>
+    </w:p>
+    <w:p>
+      <w:r>
+        <w:t>For a few moments he sat completely still. Then something in his expression changed. The usual restless energy seemed to drain out of him, leaving his face oddly calm and distant.</w:t>
       </w:r>
     </w:p>
     <w:p>
@@ -6596,28 +6502,28 @@
     </w:p>
     <w:p>
       <w:r>
-        <w:t>Then I looked at Ion. He was sitting in the same posture as before—legs crossed, hands on his knees, palms up, eyes closed. But now his sleeves, too, had tightened into bracelets. A soft, almost childlike smile had appeared on his face.</w:t>
+        <w:t>Then I looked at Ion. He was sitting in the same posture as before—legs crossed, hands on his knees, palms up, eyes closed. His sleeves, too, had tightened into bracelets, and his expression had taken on the same distant calm.</w:t>
+      </w:r>
+    </w:p>
+    <w:p>
+      <w:r>
+        <w:t>Bracing myself for what I might see next, I turned to Zara. And felt a wave of relief.</w:t>
       </w:r>
     </w:p>
     <w:p>
       <w:r>
         <w:lastRenderedPageBreak/>
-        <w:t>Bracing myself for what I might see next, I turned to Zara. And felt a wave of relief.</w:t>
-      </w:r>
-    </w:p>
-    <w:p>
-      <w:r>
         <w:t>She was unchanged. Holding her cup of tea with both hands, lifted close to her face, apparently savoring the aroma. Her gaze was calm, slightly distant. There were no bands on her sleeves. She looked as she had before.</w:t>
       </w:r>
     </w:p>
     <w:p>
       <w:r>
-        <w:t>As if to illustrate and confirm my thoughts, Art switched on the Essence Layer again. Zara’s contour and the background around her glowed with the familiar, steady emerald. But around Fang and Ion, a different effect shimmered—a “crown” of short, needle-like rays of pale green light radiating outward from their contours. It reminded me of the solar corona during an eclipse.</w:t>
-      </w:r>
-    </w:p>
-    <w:p>
-      <w:r>
-        <w:t>I shuddered. Watching it was unpleasant—borderline disturbing.</w:t>
+        <w:t>As if to illustrate and confirm my thoughts, Art switched on the Essence Layer again. Zara’s contour and the background around her glowed with the familiar, steady emerald. Around Fang and Ion, however, the glow looked different: a faint “crown” of short pale-green rays radiated outward from their contours, like the solar corona during an eclipse.</w:t>
+      </w:r>
+    </w:p>
+    <w:p>
+      <w:r>
+        <w:t>I found the effect unsettling and quickly looked away.</w:t>
       </w:r>
     </w:p>
     <w:p>
@@ -6672,13 +6578,7 @@
     </w:p>
     <w:p>
       <w:r>
-        <w:t xml:space="preserve">Art’s calm voice sounded in my </w:t>
-      </w:r>
-      <w:r>
-        <w:t>clip</w:t>
-      </w:r>
-      <w:r>
-        <w:t>.</w:t>
+        <w:t>Art’s calm voice sounded in my clip.</w:t>
       </w:r>
     </w:p>
     <w:p>
@@ -6698,13 +6598,7 @@
     </w:p>
     <w:p>
       <w:r>
-        <w:t xml:space="preserve">“In this situation? Highly unlikely. The Net Aide has identified them, saved their profiles, and uploaded their scans to the cloud. Your mask and </w:t>
-      </w:r>
-      <w:r>
-        <w:t>clip</w:t>
-      </w:r>
-      <w:r>
-        <w:t xml:space="preserve"> have nine cameras—in threat mode they record continuous video and transmit it, along with all sensor data, to remote storage. So yes, they could attack—theoretically. But they wouldn’t be able to escape responsibility. And they know that perfectly well. They’re not stupid enough to risk their freedom like that.”</w:t>
+        <w:t>“In this situation? Highly unlikely. The Net Aide has identified them, saved their profiles, and uploaded their scans to the cloud. Your mask and clip have nine cameras—in threat mode they record continuous video and transmit it, along with all sensor data, to remote storage. So yes, they could attack—theoretically. But they wouldn’t be able to escape responsibility. And they know that perfectly well. They’re not stupid enough to risk their freedom like that.”</w:t>
       </w:r>
     </w:p>
     <w:p>
@@ -6780,36 +6674,12 @@
     </w:p>
     <w:p>
       <w:r>
-        <w:t xml:space="preserve">A </w:t>
-      </w:r>
-      <w:r>
-        <w:t>Creature</w:t>
-      </w:r>
-      <w:r>
-        <w:t>.</w:t>
-      </w:r>
-    </w:p>
-    <w:p>
-      <w:r>
-        <w:t xml:space="preserve">A completely ordinary </w:t>
-      </w:r>
-      <w:r>
-        <w:t>Creature</w:t>
-      </w:r>
-      <w:r>
-        <w:t>—one of the many I had seen hundreds, if not thousands of times before.</w:t>
-      </w:r>
-      <w:r>
-        <w:t xml:space="preserve"> </w:t>
-      </w:r>
-      <w:r>
-        <w:t xml:space="preserve">And now, as was their custom, this </w:t>
-      </w:r>
-      <w:r>
-        <w:t>Creature</w:t>
-      </w:r>
-      <w:r>
-        <w:t xml:space="preserve"> had “introduced” itself.</w:t>
+        <w:t>A Creature.</w:t>
+      </w:r>
+    </w:p>
+    <w:p>
+      <w:r>
+        <w:t>A completely ordinary Creature—one of the many I had seen hundreds, if not thousands of times before. And now, as was their custom, this Creature had “introduced” itself.</w:t>
       </w:r>
     </w:p>
     <w:p>
@@ -6824,13 +6694,7 @@
     </w:p>
     <w:p>
       <w:r>
-        <w:t xml:space="preserve">“You okay?” Art’s calm voice came through the </w:t>
-      </w:r>
-      <w:r>
-        <w:t>clip</w:t>
-      </w:r>
-      <w:r>
-        <w:t>.</w:t>
+        <w:t>“You okay?” Art’s calm voice came through the clip.</w:t>
       </w:r>
     </w:p>
     <w:p>
@@ -6840,13 +6704,7 @@
     </w:p>
     <w:p>
       <w:r>
-        <w:t xml:space="preserve">“Yes. I’m fine,” I exhaled. “Just a </w:t>
-      </w:r>
-      <w:r>
-        <w:t>Creature</w:t>
-      </w:r>
-      <w:r>
-        <w:t>. A Black Jellyfish. Just… very scary-looking.”</w:t>
+        <w:t>“Yes. I’m fine,” I exhaled. “Just a Creature. A Black Jellyfish. Just… very scary-looking.”</w:t>
       </w:r>
     </w:p>
     <w:p>
@@ -6856,13 +6714,7 @@
     </w:p>
     <w:p>
       <w:r>
-        <w:t xml:space="preserve">We waited until the </w:t>
-      </w:r>
-      <w:r>
-        <w:t>Creature</w:t>
-      </w:r>
-      <w:r>
-        <w:t xml:space="preserve"> had crawled away and then headed back to the camp. I automatically glanced at the Reds.</w:t>
+        <w:t>We waited until the Creature had crawled away and then headed back to the camp. I automatically glanced at the Reds.</w:t>
       </w:r>
     </w:p>
     <w:p>
@@ -6932,21 +6784,11 @@
       </w:r>
     </w:p>
     <w:p>
-      <w:pPr>
-        <w:rPr>
-          <w:lang w:val="en-US"/>
-        </w:rPr>
-      </w:pPr>
       <w:r>
         <w:t>“Interesting,” Art said quietly. “I’ve never heard of a Creature following someone. Though…”</w:t>
       </w:r>
     </w:p>
     <w:p>
-      <w:pPr>
-        <w:rPr>
-          <w:lang w:val="en-US"/>
-        </w:rPr>
-      </w:pPr>
       <w:r>
         <w:t>He broke off.</w:t>
       </w:r>
@@ -6978,16 +6820,7 @@
     </w:p>
     <w:p>
       <w:r>
-        <w:t xml:space="preserve">I got up and saw that Fang and Ion were still asleep, stretched out on the grass in the same spots. </w:t>
-      </w:r>
-      <w:r>
-        <w:rPr>
-          <w:lang w:val="en-US"/>
-        </w:rPr>
-        <w:t xml:space="preserve">The pot </w:t>
-      </w:r>
-      <w:r>
-        <w:t>was hanging over the fire, water boiling inside. Art was sitting on a rock with a mug in his hands, and Zara was perched on her fully assembled backpack. Thin wisps of steam rose from their mugs.</w:t>
+        <w:t>I got up and saw that Fang and Ion were still asleep, stretched out on the grass in the same spots. The pot was hanging over the fire, water boiling inside. Art was sitting on a rock with a mug in his hands, and Zara was perched on her fully assembled backpack. Thin wisps of steam rose from their mugs.</w:t>
       </w:r>
     </w:p>
     <w:p>
@@ -7007,13 +6840,7 @@
     </w:p>
     <w:p>
       <w:r>
-        <w:t xml:space="preserve">Art took another mug from the “table” and began pouring coffee from the </w:t>
-      </w:r>
-      <w:r>
-        <w:t>pot</w:t>
-      </w:r>
-      <w:r>
-        <w:t>. I glanced at Zara.</w:t>
+        <w:t>Art took another mug from the “table” and began pouring coffee from the pot. I glanced at Zara.</w:t>
       </w:r>
     </w:p>
     <w:p>
@@ -7049,16 +6876,7 @@
     </w:p>
     <w:p>
       <w:r>
-        <w:t xml:space="preserve">When the packs were ready, I </w:t>
-      </w:r>
-      <w:r>
-        <w:rPr>
-          <w:lang w:val="en-US"/>
-        </w:rPr>
-        <w:t>emptied the pot</w:t>
-      </w:r>
-      <w:r>
-        <w:t>, and set it down in the grass to cool.</w:t>
+        <w:t>When the packs were ready, I emptied the pot, and set it down in the grass to cool.</w:t>
       </w:r>
     </w:p>
     <w:p>
@@ -7098,16 +6916,7 @@
     </w:p>
     <w:p>
       <w:r>
-        <w:t xml:space="preserve">I shook it, </w:t>
-      </w:r>
-      <w:r>
-        <w:rPr>
-          <w:lang w:val="en-US"/>
-        </w:rPr>
-        <w:t>gently</w:t>
-      </w:r>
-      <w:r>
-        <w:t>—and in that same second, the realization hit me: we were parting now. And we might never meet again.</w:t>
+        <w:t>I shook it, gently—and in that same second, the realization hit me: we were parting now. And we might never meet again.</w:t>
       </w:r>
     </w:p>
     <w:p>
@@ -7122,19 +6931,7 @@
     </w:p>
     <w:p>
       <w:r>
-        <w:t xml:space="preserve">“I gave Art my </w:t>
-      </w:r>
-      <w:r>
-        <w:t>Net</w:t>
-      </w:r>
-      <w:r>
-        <w:t xml:space="preserve"> ID. </w:t>
-      </w:r>
-      <w:r>
-        <w:t>Y</w:t>
-      </w:r>
-      <w:r>
-        <w:t>ou don’t have a terminal yet. If you want, you can get it from him later. Maybe someday we’ll talk again… or message.”</w:t>
+        <w:t>“I gave Art my Net ID. You don’t have a terminal yet. If you want, you can get it from him later. Maybe someday we’ll talk again… or message.”</w:t>
       </w:r>
     </w:p>
     <w:p>
@@ -7154,13 +6951,7 @@
     </w:p>
     <w:p>
       <w:r>
-        <w:t xml:space="preserve">“Don’t forget the </w:t>
-      </w:r>
-      <w:r>
-        <w:t>pot</w:t>
-      </w:r>
-      <w:r>
-        <w:t>,” he said, a hint of amusement in his voice.</w:t>
+        <w:t>“Don’t forget the pot,” he said, a hint of amusement in his voice.</w:t>
       </w:r>
     </w:p>
     <w:p>
@@ -7177,12 +6968,12 @@
       <w:pPr>
         <w:pStyle w:val="Heading1"/>
       </w:pPr>
-      <w:bookmarkStart w:id="11" w:name="_Toc227499648"/>
+      <w:bookmarkStart w:id="10" w:name="_Toc227499648"/>
       <w:r>
         <w:lastRenderedPageBreak/>
         <w:t>Chapter 9. The First Ones</w:t>
       </w:r>
-      <w:bookmarkEnd w:id="11"/>
+      <w:bookmarkEnd w:id="10"/>
     </w:p>
     <w:p>
       <w:r>
@@ -7756,12 +7547,12 @@
       <w:pPr>
         <w:pStyle w:val="Heading1"/>
       </w:pPr>
-      <w:bookmarkStart w:id="12" w:name="_Toc227499649"/>
+      <w:bookmarkStart w:id="11" w:name="_Toc227499649"/>
       <w:r>
         <w:lastRenderedPageBreak/>
         <w:t>Chapter 10. Assault</w:t>
       </w:r>
-      <w:bookmarkEnd w:id="12"/>
+      <w:bookmarkEnd w:id="11"/>
     </w:p>
     <w:p>
       <w:r>
@@ -8243,7 +8034,7 @@
       <w:pPr>
         <w:pStyle w:val="Heading1"/>
       </w:pPr>
-      <w:bookmarkStart w:id="13" w:name="_Toc227499650"/>
+      <w:bookmarkStart w:id="12" w:name="_Toc227499650"/>
       <w:r>
         <w:lastRenderedPageBreak/>
         <w:t xml:space="preserve">Chapter 11. </w:t>
@@ -8254,7 +8045,7 @@
       <w:r>
         <w:t>Freeze</w:t>
       </w:r>
-      <w:bookmarkEnd w:id="13"/>
+      <w:bookmarkEnd w:id="12"/>
     </w:p>
     <w:p>
       <w:r>
@@ -9060,12 +8851,12 @@
       <w:pPr>
         <w:pStyle w:val="Heading1"/>
       </w:pPr>
-      <w:bookmarkStart w:id="14" w:name="_Toc227499651"/>
+      <w:bookmarkStart w:id="13" w:name="_Toc227499651"/>
       <w:r>
         <w:lastRenderedPageBreak/>
         <w:t>Chapter 12. “The Wedding Cake”</w:t>
       </w:r>
-      <w:bookmarkEnd w:id="14"/>
+      <w:bookmarkEnd w:id="13"/>
     </w:p>
     <w:p>
       <w:r>
@@ -9628,7 +9419,7 @@
       <w:pPr>
         <w:pStyle w:val="Heading1"/>
       </w:pPr>
-      <w:bookmarkStart w:id="15" w:name="_Toc227499652"/>
+      <w:bookmarkStart w:id="14" w:name="_Toc227499652"/>
       <w:r>
         <w:lastRenderedPageBreak/>
         <w:t xml:space="preserve">Chapter 13. </w:t>
@@ -9642,7 +9433,7 @@
       <w:r>
         <w:t>Drift</w:t>
       </w:r>
-      <w:bookmarkEnd w:id="15"/>
+      <w:bookmarkEnd w:id="14"/>
     </w:p>
     <w:p>
       <w:r>
@@ -10284,7 +10075,7 @@
       <w:pPr>
         <w:pStyle w:val="Heading1"/>
       </w:pPr>
-      <w:bookmarkStart w:id="16" w:name="_Toc227499653"/>
+      <w:bookmarkStart w:id="15" w:name="_Toc227499653"/>
       <w:r>
         <w:lastRenderedPageBreak/>
         <w:t xml:space="preserve">Chapter 14. </w:t>
@@ -10295,7 +10086,7 @@
       <w:r>
         <w:t xml:space="preserve"> Jumping</w:t>
       </w:r>
-      <w:bookmarkEnd w:id="16"/>
+      <w:bookmarkEnd w:id="15"/>
     </w:p>
     <w:p>
       <w:r>
@@ -10982,11 +10773,11 @@
         <w:pStyle w:val="Heading1"/>
         <w:jc w:val="center"/>
       </w:pPr>
-      <w:bookmarkStart w:id="17" w:name="_Toc227499654"/>
+      <w:bookmarkStart w:id="16" w:name="_Toc227499654"/>
       <w:r>
         <w:t>Part 2</w:t>
       </w:r>
-      <w:bookmarkEnd w:id="17"/>
+      <w:bookmarkEnd w:id="16"/>
     </w:p>
     <w:p>
       <w:r>
@@ -10998,7 +10789,7 @@
       <w:pPr>
         <w:pStyle w:val="Heading1"/>
       </w:pPr>
-      <w:bookmarkStart w:id="18" w:name="_Toc227499655"/>
+      <w:bookmarkStart w:id="17" w:name="_Toc227499655"/>
       <w:r>
         <w:t xml:space="preserve">Chapter 1. </w:t>
       </w:r>
@@ -11014,7 +10805,7 @@
       <w:r>
         <w:t>: Essence Picker</w:t>
       </w:r>
-      <w:bookmarkEnd w:id="18"/>
+      <w:bookmarkEnd w:id="17"/>
     </w:p>
     <w:p>
       <w:r>
@@ -12175,12 +11966,12 @@
       <w:pPr>
         <w:pStyle w:val="Heading1"/>
       </w:pPr>
-      <w:bookmarkStart w:id="19" w:name="_Toc227499656"/>
+      <w:bookmarkStart w:id="18" w:name="_Toc227499656"/>
       <w:r>
         <w:lastRenderedPageBreak/>
         <w:t>Chapter 2. Big Tom</w:t>
       </w:r>
-      <w:bookmarkEnd w:id="19"/>
+      <w:bookmarkEnd w:id="18"/>
     </w:p>
     <w:p>
       <w:r>
@@ -12686,7 +12477,7 @@
       <w:pPr>
         <w:pStyle w:val="Heading1"/>
       </w:pPr>
-      <w:bookmarkStart w:id="20" w:name="_Toc227499657"/>
+      <w:bookmarkStart w:id="19" w:name="_Toc227499657"/>
       <w:r>
         <w:lastRenderedPageBreak/>
         <w:t xml:space="preserve">Chapter 3. </w:t>
@@ -12697,7 +12488,7 @@
       <w:r>
         <w:t>Flight</w:t>
       </w:r>
-      <w:bookmarkEnd w:id="20"/>
+      <w:bookmarkEnd w:id="19"/>
     </w:p>
     <w:p>
       <w:r>
@@ -13641,12 +13432,12 @@
       <w:pPr>
         <w:pStyle w:val="Heading1"/>
       </w:pPr>
-      <w:bookmarkStart w:id="21" w:name="_Toc227499658"/>
+      <w:bookmarkStart w:id="20" w:name="_Toc227499658"/>
       <w:r>
         <w:lastRenderedPageBreak/>
         <w:t>Chapter 4. Integration</w:t>
       </w:r>
-      <w:bookmarkEnd w:id="21"/>
+      <w:bookmarkEnd w:id="20"/>
     </w:p>
     <w:p>
       <w:r>
@@ -14274,12 +14065,12 @@
       <w:pPr>
         <w:pStyle w:val="Heading1"/>
       </w:pPr>
-      <w:bookmarkStart w:id="22" w:name="_Toc227499659"/>
+      <w:bookmarkStart w:id="21" w:name="_Toc227499659"/>
       <w:r>
         <w:lastRenderedPageBreak/>
         <w:t>Chapter 5. Trillium</w:t>
       </w:r>
-      <w:bookmarkEnd w:id="22"/>
+      <w:bookmarkEnd w:id="21"/>
     </w:p>
     <w:p>
       <w:r>
@@ -14878,12 +14669,12 @@
       <w:pPr>
         <w:pStyle w:val="Heading1"/>
       </w:pPr>
-      <w:bookmarkStart w:id="23" w:name="_Toc227499660"/>
+      <w:bookmarkStart w:id="22" w:name="_Toc227499660"/>
       <w:r>
         <w:lastRenderedPageBreak/>
         <w:t>Chapter 6. The Afterparty</w:t>
       </w:r>
-      <w:bookmarkEnd w:id="23"/>
+      <w:bookmarkEnd w:id="22"/>
     </w:p>
     <w:p>
       <w:r>
@@ -15969,12 +15760,12 @@
       <w:pPr>
         <w:pStyle w:val="Heading1"/>
       </w:pPr>
-      <w:bookmarkStart w:id="24" w:name="_Toc227499661"/>
+      <w:bookmarkStart w:id="23" w:name="_Toc227499661"/>
       <w:r>
         <w:lastRenderedPageBreak/>
         <w:t>Chapter 7. Settling In</w:t>
       </w:r>
-      <w:bookmarkEnd w:id="24"/>
+      <w:bookmarkEnd w:id="23"/>
     </w:p>
     <w:p>
       <w:r>
@@ -16703,7 +16494,7 @@
       <w:pPr>
         <w:pStyle w:val="Heading1"/>
       </w:pPr>
-      <w:bookmarkStart w:id="25" w:name="_Toc227499662"/>
+      <w:bookmarkStart w:id="24" w:name="_Toc227499662"/>
       <w:r>
         <w:lastRenderedPageBreak/>
         <w:t xml:space="preserve">Chapter 8. </w:t>
@@ -16711,7 +16502,7 @@
       <w:r>
         <w:t>Download</w:t>
       </w:r>
-      <w:bookmarkEnd w:id="25"/>
+      <w:bookmarkEnd w:id="24"/>
     </w:p>
     <w:p>
       <w:r>
@@ -17588,12 +17379,12 @@
       <w:pPr>
         <w:pStyle w:val="Heading1"/>
       </w:pPr>
-      <w:bookmarkStart w:id="26" w:name="_Toc227499663"/>
+      <w:bookmarkStart w:id="25" w:name="_Toc227499663"/>
       <w:r>
         <w:lastRenderedPageBreak/>
         <w:t>Chapter 9. Awakening</w:t>
       </w:r>
-      <w:bookmarkEnd w:id="26"/>
+      <w:bookmarkEnd w:id="25"/>
     </w:p>
     <w:p>
       <w:r>
@@ -18139,12 +17930,12 @@
       <w:pPr>
         <w:pStyle w:val="Heading1"/>
       </w:pPr>
-      <w:bookmarkStart w:id="27" w:name="_Toc227499664"/>
+      <w:bookmarkStart w:id="26" w:name="_Toc227499664"/>
       <w:r>
         <w:lastRenderedPageBreak/>
         <w:t>Chapter 10. The Closed Ground</w:t>
       </w:r>
-      <w:bookmarkEnd w:id="27"/>
+      <w:bookmarkEnd w:id="26"/>
     </w:p>
     <w:p>
       <w:r>
@@ -19046,12 +18837,12 @@
       <w:pPr>
         <w:pStyle w:val="Heading1"/>
       </w:pPr>
-      <w:bookmarkStart w:id="28" w:name="_Toc227499665"/>
+      <w:bookmarkStart w:id="27" w:name="_Toc227499665"/>
       <w:r>
         <w:lastRenderedPageBreak/>
         <w:t>Chapter 11. The Open Ground</w:t>
       </w:r>
-      <w:bookmarkEnd w:id="28"/>
+      <w:bookmarkEnd w:id="27"/>
     </w:p>
     <w:p>
       <w:r>
@@ -19657,12 +19448,12 @@
       <w:pPr>
         <w:pStyle w:val="Heading1"/>
       </w:pPr>
-      <w:bookmarkStart w:id="29" w:name="_Toc227499666"/>
+      <w:bookmarkStart w:id="28" w:name="_Toc227499666"/>
       <w:r>
         <w:lastRenderedPageBreak/>
         <w:t>Chapter 12. Waiting</w:t>
       </w:r>
-      <w:bookmarkEnd w:id="29"/>
+      <w:bookmarkEnd w:id="28"/>
     </w:p>
     <w:p>
       <w:r>
@@ -20220,12 +20011,12 @@
       <w:pPr>
         <w:pStyle w:val="Heading1"/>
       </w:pPr>
-      <w:bookmarkStart w:id="30" w:name="_Toc227499667"/>
+      <w:bookmarkStart w:id="29" w:name="_Toc227499667"/>
       <w:r>
         <w:lastRenderedPageBreak/>
         <w:t>Chapter 13. A Friendly Dinner</w:t>
       </w:r>
-      <w:bookmarkEnd w:id="30"/>
+      <w:bookmarkEnd w:id="29"/>
     </w:p>
     <w:p>
       <w:r>
@@ -21381,7 +21172,7 @@
       <w:pPr>
         <w:pStyle w:val="Heading1"/>
       </w:pPr>
-      <w:bookmarkStart w:id="31" w:name="_Toc227499668"/>
+      <w:bookmarkStart w:id="30" w:name="_Toc227499668"/>
       <w:r>
         <w:lastRenderedPageBreak/>
         <w:t>Chapter 14. False Memory 2</w:t>
@@ -21392,7 +21183,7 @@
       <w:r>
         <w:t xml:space="preserve"> Dragon Wrangler</w:t>
       </w:r>
-      <w:bookmarkEnd w:id="31"/>
+      <w:bookmarkEnd w:id="30"/>
     </w:p>
     <w:p>
       <w:r>
@@ -21843,12 +21634,12 @@
       <w:pPr>
         <w:pStyle w:val="Heading1"/>
       </w:pPr>
-      <w:bookmarkStart w:id="32" w:name="_Toc227499669"/>
+      <w:bookmarkStart w:id="31" w:name="_Toc227499669"/>
       <w:r>
         <w:lastRenderedPageBreak/>
         <w:t>Epilogue</w:t>
       </w:r>
-      <w:bookmarkEnd w:id="32"/>
+      <w:bookmarkEnd w:id="31"/>
     </w:p>
     <w:p>
       <w:r>

</xml_diff>